<commit_message>
docs: add research revision documents and responses to address examiner feedback
</commit_message>
<xml_diff>
--- a/SKRIPSI.docx
+++ b/SKRIPSI.docx
@@ -1,6 +1,6 @@
 
 <file path=word/document.xml><?xml version="1.0" encoding="utf-8"?>
-<w:document xmlns:wpc="http://schemas.microsoft.com/office/word/2010/wordprocessingCanvas" xmlns:cx="http://schemas.microsoft.com/office/drawing/2014/chartex" xmlns:cx1="http://schemas.microsoft.com/office/drawing/2015/9/8/chartex" xmlns:cx2="http://schemas.microsoft.com/office/drawing/2015/10/21/chartex" xmlns:cx3="http://schemas.microsoft.com/office/drawing/2016/5/9/chartex" xmlns:cx4="http://schemas.microsoft.com/office/drawing/2016/5/10/chartex" xmlns:cx5="http://schemas.microsoft.com/office/drawing/2016/5/11/chartex" xmlns:cx6="http://schemas.microsoft.com/office/drawing/2016/5/12/chartex" xmlns:cx7="http://schemas.microsoft.com/office/drawing/2016/5/13/chartex" xmlns:cx8="http://schemas.microsoft.com/office/drawing/2016/5/14/chartex" xmlns:mc="http://schemas.openxmlformats.org/markup-compatibility/2006" xmlns:aink="http://schemas.microsoft.com/office/drawing/2016/ink" xmlns:am3d="http://schemas.microsoft.com/office/drawing/2017/model3d" xmlns:o="urn:schemas-microsoft-com:office:office" xmlns:r="http://schemas.openxmlformats.org/officeDocument/2006/relationships" xmlns:m="http://schemas.openxmlformats.org/officeDocument/2006/math" xmlns:v="urn:schemas-microsoft-com:vml" xmlns:wp14="http://schemas.microsoft.com/office/word/2010/wordprocessingDrawing" xmlns:wp="http://schemas.openxmlformats.org/drawingml/2006/wordprocessingDrawing" xmlns:w10="urn:schemas-microsoft-com:office:word" xmlns:w="http://schemas.openxmlformats.org/wordprocessingml/2006/main" xmlns:w14="http://schemas.microsoft.com/office/word/2010/wordml" xmlns:w15="http://schemas.microsoft.com/office/word/2012/wordml" xmlns:w16cex="http://schemas.microsoft.com/office/word/2018/wordml/cex" xmlns:w16cid="http://schemas.microsoft.com/office/word/2016/wordml/cid" xmlns:w16="http://schemas.microsoft.com/office/word/2018/wordml" xmlns:w16sdtdh="http://schemas.microsoft.com/office/word/2020/wordml/sdtdatahash" xmlns:w16se="http://schemas.microsoft.com/office/word/2015/wordml/symex" xmlns:wpg="http://schemas.microsoft.com/office/word/2010/wordprocessingGroup" xmlns:wpi="http://schemas.microsoft.com/office/word/2010/wordprocessingInk" xmlns:wne="http://schemas.microsoft.com/office/word/2006/wordml" xmlns:wps="http://schemas.microsoft.com/office/word/2010/wordprocessingShape" mc:Ignorable="w14 w15 w16se w16cid w16 w16cex w16sdtdh wp14">
+<w:document xmlns:wpc="http://schemas.microsoft.com/office/word/2010/wordprocessingCanvas" xmlns:cx="http://schemas.microsoft.com/office/drawing/2014/chartex" xmlns:cx1="http://schemas.microsoft.com/office/drawing/2015/9/8/chartex" xmlns:cx2="http://schemas.microsoft.com/office/drawing/2015/10/21/chartex" xmlns:cx3="http://schemas.microsoft.com/office/drawing/2016/5/9/chartex" xmlns:cx4="http://schemas.microsoft.com/office/drawing/2016/5/10/chartex" xmlns:cx5="http://schemas.microsoft.com/office/drawing/2016/5/11/chartex" xmlns:cx6="http://schemas.microsoft.com/office/drawing/2016/5/12/chartex" xmlns:cx7="http://schemas.microsoft.com/office/drawing/2016/5/13/chartex" xmlns:cx8="http://schemas.microsoft.com/office/drawing/2016/5/14/chartex" xmlns:mc="http://schemas.openxmlformats.org/markup-compatibility/2006" xmlns:aink="http://schemas.microsoft.com/office/drawing/2016/ink" xmlns:am3d="http://schemas.microsoft.com/office/drawing/2017/model3d" xmlns:o="urn:schemas-microsoft-com:office:office" xmlns:oel="http://schemas.microsoft.com/office/2019/extlst" xmlns:r="http://schemas.openxmlformats.org/officeDocument/2006/relationships" xmlns:m="http://schemas.openxmlformats.org/officeDocument/2006/math" xmlns:v="urn:schemas-microsoft-com:vml" xmlns:wp14="http://schemas.microsoft.com/office/word/2010/wordprocessingDrawing" xmlns:wp="http://schemas.openxmlformats.org/drawingml/2006/wordprocessingDrawing" xmlns:w10="urn:schemas-microsoft-com:office:word" xmlns:w="http://schemas.openxmlformats.org/wordprocessingml/2006/main" xmlns:w14="http://schemas.microsoft.com/office/word/2010/wordml" xmlns:w15="http://schemas.microsoft.com/office/word/2012/wordml" xmlns:w16cex="http://schemas.microsoft.com/office/word/2018/wordml/cex" xmlns:w16cid="http://schemas.microsoft.com/office/word/2016/wordml/cid" xmlns:w16="http://schemas.microsoft.com/office/word/2018/wordml" xmlns:w16du="http://schemas.microsoft.com/office/word/2023/wordml/word16du" xmlns:w16sdtdh="http://schemas.microsoft.com/office/word/2020/wordml/sdtdatahash" xmlns:w16sdtfl="http://schemas.microsoft.com/office/word/2024/wordml/sdtformatlock" xmlns:w16se="http://schemas.microsoft.com/office/word/2015/wordml/symex" xmlns:wpg="http://schemas.microsoft.com/office/word/2010/wordprocessingGroup" xmlns:wpi="http://schemas.microsoft.com/office/word/2010/wordprocessingInk" xmlns:wne="http://schemas.microsoft.com/office/word/2006/wordml" xmlns:wps="http://schemas.microsoft.com/office/word/2010/wordprocessingShape" mc:Ignorable="w14 w15 w16se w16cid w16 w16cex w16sdtdh w16sdtfl w16du wp14">
   <w:body>
     <w:p>
       <w:pPr>
@@ -35,7 +35,17 @@
           <w:szCs w:val="24"/>
         </w:rPr>
         <w:br/>
-        <w:t xml:space="preserve">ANALISIS SENTIMEN PENDENGAR LAGU “ARTERI” OLEH </w:t>
+        <w:t xml:space="preserve">ANALISIS SENTIMEN PENDENGAR LAGU “ARTERI” </w:t>
+      </w:r>
+      <w:proofErr w:type="gramStart"/>
+      <w:r>
+        <w:rPr>
+          <w:rFonts w:cs="Times New Roman"/>
+          <w:b/>
+          <w:bCs/>
+          <w:szCs w:val="24"/>
+        </w:rPr>
+        <w:t xml:space="preserve">OLEH </w:t>
       </w:r>
       <w:r>
         <w:rPr>
@@ -48,6 +58,7 @@
         </w:rPr>
         <w:t>.FEAST</w:t>
       </w:r>
+      <w:proofErr w:type="gramEnd"/>
       <w:r>
         <w:rPr>
           <w:rFonts w:cs="Times New Roman"/>
@@ -973,7 +984,47 @@
                 <w:color w:val="000000"/>
                 <w:szCs w:val="24"/>
               </w:rPr>
-              <w:t>Abdul Halim Anshor S.Kom., M.Kom.</w:t>
+              <w:t xml:space="preserve">Abdul Halim Anshor </w:t>
+            </w:r>
+            <w:proofErr w:type="gramStart"/>
+            <w:r>
+              <w:rPr>
+                <w:b/>
+                <w:bCs/>
+                <w:color w:val="000000"/>
+                <w:szCs w:val="24"/>
+              </w:rPr>
+              <w:t>S.Kom</w:t>
+            </w:r>
+            <w:proofErr w:type="gramEnd"/>
+            <w:r>
+              <w:rPr>
+                <w:b/>
+                <w:bCs/>
+                <w:color w:val="000000"/>
+                <w:szCs w:val="24"/>
+              </w:rPr>
+              <w:t xml:space="preserve">., </w:t>
+            </w:r>
+            <w:proofErr w:type="gramStart"/>
+            <w:r>
+              <w:rPr>
+                <w:b/>
+                <w:bCs/>
+                <w:color w:val="000000"/>
+                <w:szCs w:val="24"/>
+              </w:rPr>
+              <w:t>M.Kom</w:t>
+            </w:r>
+            <w:proofErr w:type="gramEnd"/>
+            <w:r>
+              <w:rPr>
+                <w:b/>
+                <w:bCs/>
+                <w:color w:val="000000"/>
+                <w:szCs w:val="24"/>
+              </w:rPr>
+              <w:t>.</w:t>
             </w:r>
           </w:p>
           <w:p>
@@ -1092,7 +1143,47 @@
                 <w:color w:val="000000"/>
                 <w:szCs w:val="24"/>
               </w:rPr>
-              <w:t>Karina Imelda S.Kom., M.Kom.</w:t>
+              <w:t xml:space="preserve">Karina Imelda </w:t>
+            </w:r>
+            <w:proofErr w:type="gramStart"/>
+            <w:r>
+              <w:rPr>
+                <w:b/>
+                <w:bCs/>
+                <w:color w:val="000000"/>
+                <w:szCs w:val="24"/>
+              </w:rPr>
+              <w:t>S.Kom</w:t>
+            </w:r>
+            <w:proofErr w:type="gramEnd"/>
+            <w:r>
+              <w:rPr>
+                <w:b/>
+                <w:bCs/>
+                <w:color w:val="000000"/>
+                <w:szCs w:val="24"/>
+              </w:rPr>
+              <w:t xml:space="preserve">., </w:t>
+            </w:r>
+            <w:proofErr w:type="gramStart"/>
+            <w:r>
+              <w:rPr>
+                <w:b/>
+                <w:bCs/>
+                <w:color w:val="000000"/>
+                <w:szCs w:val="24"/>
+              </w:rPr>
+              <w:t>M.Kom</w:t>
+            </w:r>
+            <w:proofErr w:type="gramEnd"/>
+            <w:r>
+              <w:rPr>
+                <w:b/>
+                <w:bCs/>
+                <w:color w:val="000000"/>
+                <w:szCs w:val="24"/>
+              </w:rPr>
+              <w:t>.</w:t>
             </w:r>
           </w:p>
           <w:p>
@@ -1748,7 +1839,11 @@
       </w:pPr>
       <w:r>
         <w:tab/>
-        <w:t xml:space="preserve">Dengan ini saya menyatakan bahwa proposal penelitian yang berjudul “Analisis Sentimen Pendengar Lagu Arteri oleh </w:t>
+        <w:t xml:space="preserve">Dengan ini saya menyatakan bahwa proposal penelitian yang berjudul “Analisis Sentimen Pendengar Lagu Arteri </w:t>
+      </w:r>
+      <w:proofErr w:type="gramStart"/>
+      <w:r>
+        <w:t xml:space="preserve">oleh </w:t>
       </w:r>
       <w:r>
         <w:rPr>
@@ -1757,6 +1852,7 @@
         </w:rPr>
         <w:t>.Feast</w:t>
       </w:r>
+      <w:proofErr w:type="gramEnd"/>
       <w:r>
         <w:t xml:space="preserve"> </w:t>
       </w:r>
@@ -2135,7 +2231,14 @@
         <w:rPr>
           <w:lang w:val="en-ID"/>
         </w:rPr>
-        <w:t>Penulis berterima kasih kepada Allah SWT atas rahmat dan karunia-Nya yang telah memungkinkan penulis menyelesaikan proposal penelitian berjudul "Analisis Sentimen Pendengar Lagu Arteri oleh</w:t>
+        <w:t xml:space="preserve">Penulis berterima kasih kepada Allah SWT atas rahmat dan karunia-Nya yang telah memungkinkan penulis menyelesaikan proposal penelitian berjudul "Analisis Sentimen Pendengar Lagu Arteri </w:t>
+      </w:r>
+      <w:proofErr w:type="gramStart"/>
+      <w:r>
+        <w:rPr>
+          <w:lang w:val="en-ID"/>
+        </w:rPr>
+        <w:t>oleh</w:t>
       </w:r>
       <w:r>
         <w:rPr>
@@ -2159,6 +2262,7 @@
         </w:rPr>
         <w:t>Feast</w:t>
       </w:r>
+      <w:proofErr w:type="gramEnd"/>
       <w:r>
         <w:rPr>
           <w:lang w:val="en-ID"/>
@@ -2368,7 +2472,23 @@
           <w:i/>
           <w:iCs/>
         </w:rPr>
-        <w:t>Life is a vast canvas, meaning is found the colors we dare to paint</w:t>
+        <w:t xml:space="preserve">Life is a vast </w:t>
+      </w:r>
+      <w:proofErr w:type="gramStart"/>
+      <w:r>
+        <w:rPr>
+          <w:i/>
+          <w:iCs/>
+        </w:rPr>
+        <w:t>canvas,</w:t>
+      </w:r>
+      <w:proofErr w:type="gramEnd"/>
+      <w:r>
+        <w:rPr>
+          <w:i/>
+          <w:iCs/>
+        </w:rPr>
+        <w:t xml:space="preserve"> meaning is found the colors we dare to paint</w:t>
       </w:r>
       <w:r>
         <w:rPr>
@@ -2578,7 +2698,14 @@
         <w:rPr>
           <w:lang w:val="en-ID"/>
         </w:rPr>
-        <w:t xml:space="preserve">“Arteri" oleh </w:t>
+        <w:t xml:space="preserve">“Arteri" </w:t>
+      </w:r>
+      <w:proofErr w:type="gramStart"/>
+      <w:r>
+        <w:rPr>
+          <w:lang w:val="en-ID"/>
+        </w:rPr>
+        <w:t xml:space="preserve">oleh </w:t>
       </w:r>
       <w:r>
         <w:rPr>
@@ -2588,6 +2715,7 @@
         </w:rPr>
         <w:t>.Feast</w:t>
       </w:r>
+      <w:proofErr w:type="gramEnd"/>
       <w:r>
         <w:rPr>
           <w:lang w:val="en-ID"/>
@@ -2682,7 +2810,14 @@
         <w:rPr>
           <w:lang w:val="en-ID"/>
         </w:rPr>
-        <w:t xml:space="preserve">Lagu "Arteri" dari grup musik </w:t>
+        <w:t xml:space="preserve">Lagu "Arteri" dari grup </w:t>
+      </w:r>
+      <w:proofErr w:type="gramStart"/>
+      <w:r>
+        <w:rPr>
+          <w:lang w:val="en-ID"/>
+        </w:rPr>
+        <w:t xml:space="preserve">musik </w:t>
       </w:r>
       <w:r>
         <w:rPr>
@@ -2692,6 +2827,7 @@
         </w:rPr>
         <w:t>.Feast</w:t>
       </w:r>
+      <w:proofErr w:type="gramEnd"/>
       <w:r>
         <w:rPr>
           <w:lang w:val="en-ID"/>
@@ -2860,7 +2996,23 @@
           <w:i/>
           <w:iCs/>
         </w:rPr>
-        <w:t xml:space="preserve"> YouTube, .Feast.</w:t>
+        <w:t xml:space="preserve"> YouTube</w:t>
+      </w:r>
+      <w:proofErr w:type="gramStart"/>
+      <w:r>
+        <w:rPr>
+          <w:i/>
+          <w:iCs/>
+        </w:rPr>
+        <w:t>, .Feast</w:t>
+      </w:r>
+      <w:proofErr w:type="gramEnd"/>
+      <w:r>
+        <w:rPr>
+          <w:i/>
+          <w:iCs/>
+        </w:rPr>
+        <w:t>.</w:t>
       </w:r>
     </w:p>
     <w:p>
@@ -2921,7 +3073,23 @@
           <w:i/>
           <w:iCs/>
         </w:rPr>
-        <w:t xml:space="preserve">"The song 'Arteri' by the music group .Feast serves as a medium of emotional inspiration for listeners navigating the 'quarter-life crisis' phenomenon, generating thousands of public responses on the YouTube platform. However, conventional analysis methods struggle to accurately identify sentiment patterns due to the high volume of unstructured textual data and the prevalence of informal Indonesian, slang, and sarcasm. This research aims to implement and evaluate the performance of the </w:t>
+        <w:t xml:space="preserve">"The song 'Arteri' by the music </w:t>
+      </w:r>
+      <w:proofErr w:type="gramStart"/>
+      <w:r>
+        <w:rPr>
+          <w:i/>
+          <w:iCs/>
+        </w:rPr>
+        <w:t>group .Feast</w:t>
+      </w:r>
+      <w:proofErr w:type="gramEnd"/>
+      <w:r>
+        <w:rPr>
+          <w:i/>
+          <w:iCs/>
+        </w:rPr>
+        <w:t xml:space="preserve"> serves as a medium of emotional inspiration for listeners navigating the 'quarter-life crisis' phenomenon, generating thousands of public responses on the YouTube platform. However, conventional analysis methods struggle to accurately identify sentiment patterns due to the high volume of unstructured textual data and the prevalence of informal Indonesian, slang, and sarcasm. This research aims to implement and evaluate the performance of the </w:t>
       </w:r>
       <w:r>
         <w:rPr>
@@ -2989,7 +3157,23 @@
           <w:i/>
           <w:iCs/>
         </w:rPr>
-        <w:t>, Natural Language Processing (NLP), YouTube, .Feast.</w:t>
+        <w:t>, Natural Language Processing (NLP), YouTube</w:t>
+      </w:r>
+      <w:proofErr w:type="gramStart"/>
+      <w:r>
+        <w:rPr>
+          <w:i/>
+          <w:iCs/>
+        </w:rPr>
+        <w:t>, .Feast</w:t>
+      </w:r>
+      <w:proofErr w:type="gramEnd"/>
+      <w:r>
+        <w:rPr>
+          <w:i/>
+          <w:iCs/>
+        </w:rPr>
+        <w:t>.</w:t>
       </w:r>
       <w:r>
         <w:rPr>
@@ -8965,7 +9149,18 @@
           <w:lang w:val="en-ID" w:eastAsia="en-ID"/>
           <w14:ligatures w14:val="none"/>
         </w:rPr>
-        <w:t xml:space="preserve">Hanya teks komentar dari video musik resmi lagu grup musik "Arteri" yang digunakan sebagai sumber data penelitian </w:t>
+        <w:t xml:space="preserve">Hanya teks komentar dari video musik resmi lagu grup musik "Arteri" yang digunakan sebagai sumber data </w:t>
+      </w:r>
+      <w:proofErr w:type="gramStart"/>
+      <w:r>
+        <w:rPr>
+          <w:rFonts w:eastAsia="Times New Roman" w:cs="Times New Roman"/>
+          <w:kern w:val="0"/>
+          <w:szCs w:val="24"/>
+          <w:lang w:val="en-ID" w:eastAsia="en-ID"/>
+          <w14:ligatures w14:val="none"/>
+        </w:rPr>
+        <w:t xml:space="preserve">penelitian </w:t>
       </w:r>
       <w:r>
         <w:rPr>
@@ -8979,6 +9174,7 @@
         </w:rPr>
         <w:t>.Feast</w:t>
       </w:r>
+      <w:proofErr w:type="gramEnd"/>
       <w:r>
         <w:rPr>
           <w:rFonts w:eastAsia="Times New Roman" w:cs="Times New Roman"/>
@@ -9166,7 +9362,11 @@
         <w:jc w:val="both"/>
       </w:pPr>
       <w:r>
-        <w:t>Bagaimana penerapan algoritma SVM dengan pembobotan TF-IDF untuk mengklasifikasikan sentimen komentar publik pada video musik ".</w:t>
+        <w:t xml:space="preserve">Bagaimana penerapan algoritma SVM dengan pembobotan TF-IDF untuk mengklasifikasikan sentimen komentar publik pada video musik </w:t>
+      </w:r>
+      <w:proofErr w:type="gramStart"/>
+      <w:r>
+        <w:t>".</w:t>
       </w:r>
       <w:r>
         <w:rPr>
@@ -9175,6 +9375,7 @@
         </w:rPr>
         <w:t>Feast</w:t>
       </w:r>
+      <w:proofErr w:type="gramEnd"/>
       <w:r>
         <w:t xml:space="preserve"> - Arteri"</w:t>
       </w:r>
@@ -9329,12 +9530,21 @@
       <w:r>
         <w:t xml:space="preserve"> video musik </w:t>
       </w:r>
+      <w:proofErr w:type="gramStart"/>
       <w:r>
         <w:rPr>
           <w:i/>
           <w:iCs/>
         </w:rPr>
-        <w:t xml:space="preserve">".Feast </w:t>
+        <w:t>".Feast</w:t>
+      </w:r>
+      <w:proofErr w:type="gramEnd"/>
+      <w:r>
+        <w:rPr>
+          <w:i/>
+          <w:iCs/>
+        </w:rPr>
+        <w:t xml:space="preserve"> </w:t>
       </w:r>
       <w:r>
         <w:t>- Arteri".</w:t>
@@ -9626,7 +9836,18 @@
           <w:lang w:val="en-ID"/>
           <w14:ligatures w14:val="none"/>
         </w:rPr>
-        <w:t xml:space="preserve">Bagi Grup Musik </w:t>
+        <w:t xml:space="preserve">Bagi Grup </w:t>
+      </w:r>
+      <w:proofErr w:type="gramStart"/>
+      <w:r>
+        <w:rPr>
+          <w:rFonts w:eastAsia="Times New Roman" w:cs="Times New Roman"/>
+          <w:kern w:val="0"/>
+          <w:szCs w:val="24"/>
+          <w:lang w:val="en-ID"/>
+          <w14:ligatures w14:val="none"/>
+        </w:rPr>
+        <w:t xml:space="preserve">Musik </w:t>
       </w:r>
       <w:r>
         <w:rPr>
@@ -9652,6 +9873,7 @@
         </w:rPr>
         <w:t>Feast</w:t>
       </w:r>
+      <w:proofErr w:type="gramEnd"/>
       <w:r>
         <w:rPr>
           <w:rFonts w:eastAsia="Times New Roman" w:cs="Times New Roman"/>
@@ -9875,7 +10097,14 @@
         <w:rPr>
           <w:lang w:val="en-ID"/>
         </w:rPr>
-        <w:t xml:space="preserve">Bab ini membahas latar belakang masalah yang memuat konteks penelitian, yaitu betapa pentingnya melakukan analisis sentimen pada lagu grup musik "Arteri" </w:t>
+        <w:t>Bab ini membahas latar belakang masalah yang memuat konteks penelitian, yaitu betapa pentingnya melakukan analisis sentimen pada lagu grup musik "Arteri</w:t>
+      </w:r>
+      <w:proofErr w:type="gramStart"/>
+      <w:r>
+        <w:rPr>
+          <w:lang w:val="en-ID"/>
+        </w:rPr>
+        <w:t xml:space="preserve">" </w:t>
       </w:r>
       <w:r>
         <w:rPr>
@@ -9885,6 +10114,7 @@
         </w:rPr>
         <w:t>.Feast</w:t>
       </w:r>
+      <w:proofErr w:type="gramEnd"/>
       <w:r>
         <w:rPr>
           <w:lang w:val="en-ID"/>
@@ -11532,6 +11762,9 @@
               <w:lastRenderedPageBreak/>
               <w:t>sebesar 97,5%, dibandingkan Polynomial Kernel (96,5%) dan RBF Kernel (97%). Mayoritas ulasan bersifat positif</w:t>
             </w:r>
+            <w:r>
+              <w:t>.</w:t>
+            </w:r>
           </w:p>
         </w:tc>
         <w:tc>
@@ -11657,6 +11890,9 @@
             </w:pPr>
             <w:r>
               <w:t>Algoritma SVM terbukti efektif dalam mengklasifikasikan sentimen ulasan produk skincare berbahasa Indonesia. Mayoritas ulasan bersifat positif, menunjukkan produk Skintific cukup diminati oleh konsumen</w:t>
+            </w:r>
+            <w:r>
+              <w:t>.</w:t>
             </w:r>
           </w:p>
         </w:tc>
@@ -14893,7 +15129,14 @@
         <w:rPr>
           <w:lang w:val="en-ID"/>
         </w:rPr>
-        <w:t>Kerangka berpikir penelitian ini dibuat untuk mengatasi masalah mengevaluasi pendapat publik tentang kolom komentar video musik "</w:t>
+        <w:t xml:space="preserve">Kerangka berpikir penelitian ini dibuat untuk mengatasi masalah mengevaluasi pendapat publik tentang kolom komentar video musik </w:t>
+      </w:r>
+      <w:proofErr w:type="gramStart"/>
+      <w:r>
+        <w:rPr>
+          <w:lang w:val="en-ID"/>
+        </w:rPr>
+        <w:t>"</w:t>
       </w:r>
       <w:r>
         <w:rPr>
@@ -14909,6 +15152,7 @@
         </w:rPr>
         <w:t>Feast</w:t>
       </w:r>
+      <w:proofErr w:type="gramEnd"/>
       <w:r>
         <w:rPr>
           <w:lang w:val="en-ID"/>
@@ -15146,7 +15390,11 @@
               <w:jc w:val="both"/>
             </w:pPr>
             <w:r>
-              <w:t>Opini publik yang masif pada video musik '.</w:t>
+              <w:t xml:space="preserve">Opini publik yang masif pada video musik </w:t>
+            </w:r>
+            <w:proofErr w:type="gramStart"/>
+            <w:r>
+              <w:t>'.</w:t>
             </w:r>
             <w:r>
               <w:rPr>
@@ -15155,6 +15403,7 @@
               </w:rPr>
               <w:t>Feast</w:t>
             </w:r>
+            <w:proofErr w:type="gramEnd"/>
             <w:r>
               <w:t xml:space="preserve"> - Arteri'.</w:t>
             </w:r>
@@ -15279,7 +15528,7 @@
               </wp:anchor>
             </w:drawing>
           </mc:Choice>
-          <mc:Fallback xmlns:w16sdtfl="http://schemas.microsoft.com/office/word/2024/wordml/sdtformatlock" xmlns:w16du="http://schemas.microsoft.com/office/word/2023/wordml/word16du" xmlns:oel="http://schemas.microsoft.com/office/2019/extlst">
+          <mc:Fallback>
             <w:pict>
               <v:shapetype w14:anchorId="1CEEF7D3" id="_x0000_t32" coordsize="21600,21600" o:spt="32" o:oned="t" path="m,l21600,21600e" filled="f">
                 <v:path arrowok="t" fillok="f" o:connecttype="none"/>
@@ -15344,7 +15593,11 @@
               <w:jc w:val="both"/>
             </w:pPr>
             <w:r>
-              <w:t>Sumber data diambil dari kolom komentar YouTube resmi .</w:t>
+              <w:t xml:space="preserve">Sumber data diambil dari kolom komentar YouTube </w:t>
+            </w:r>
+            <w:proofErr w:type="gramStart"/>
+            <w:r>
+              <w:t>resmi .</w:t>
             </w:r>
             <w:r>
               <w:rPr>
@@ -15353,6 +15606,7 @@
               </w:rPr>
               <w:t>Feast</w:t>
             </w:r>
+            <w:proofErr w:type="gramEnd"/>
             <w:r>
               <w:t>. Menggunaknan Teknik observasi non-partisipan (</w:t>
             </w:r>
@@ -15448,7 +15702,7 @@
               </wp:anchor>
             </w:drawing>
           </mc:Choice>
-          <mc:Fallback xmlns:w16sdtfl="http://schemas.microsoft.com/office/word/2024/wordml/sdtformatlock" xmlns:w16du="http://schemas.microsoft.com/office/word/2023/wordml/word16du" xmlns:oel="http://schemas.microsoft.com/office/2019/extlst">
+          <mc:Fallback>
             <w:pict>
               <v:shape w14:anchorId="03125B54" id="Straight Arrow Connector 1" o:spid="_x0000_s1026" type="#_x0000_t32" style="position:absolute;margin-left:204.75pt;margin-top:2.7pt;width:0;height:27pt;z-index:251662336;visibility:visible;mso-wrap-style:square;mso-width-percent:0;mso-height-percent:0;mso-wrap-distance-left:9pt;mso-wrap-distance-top:0;mso-wrap-distance-right:9pt;mso-wrap-distance-bottom:0;mso-position-horizontal:absolute;mso-position-horizontal-relative:text;mso-position-vertical:absolute;mso-position-vertical-relative:text;mso-width-percent:0;mso-height-percent:0;mso-width-relative:margin;mso-height-relative:margin" o:gfxdata="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" strokecolor="black [3200]" strokeweight=".5pt">
                 <v:stroke endarrow="block" joinstyle="miter"/>
@@ -15683,7 +15937,7 @@
               </wp:anchor>
             </w:drawing>
           </mc:Choice>
-          <mc:Fallback xmlns:w16sdtfl="http://schemas.microsoft.com/office/word/2024/wordml/sdtformatlock" xmlns:w16du="http://schemas.microsoft.com/office/word/2023/wordml/word16du" xmlns:oel="http://schemas.microsoft.com/office/2019/extlst">
+          <mc:Fallback>
             <w:pict>
               <v:shape w14:anchorId="767AEA4B" id="Straight Arrow Connector 1" o:spid="_x0000_s1026" type="#_x0000_t32" style="position:absolute;margin-left:204.6pt;margin-top:4.55pt;width:0;height:27pt;z-index:251660288;visibility:visible;mso-wrap-style:square;mso-wrap-distance-left:9pt;mso-wrap-distance-top:0;mso-wrap-distance-right:9pt;mso-wrap-distance-bottom:0;mso-position-horizontal:absolute;mso-position-horizontal-relative:text;mso-position-vertical:absolute;mso-position-vertical-relative:text" o:gfxdata="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" strokecolor="black [3200]" strokeweight=".5pt">
                 <v:stroke endarrow="block" joinstyle="miter"/>
@@ -16695,7 +16949,14 @@
         <w:rPr>
           <w:lang w:val="en-ID" w:eastAsia="en-ID"/>
         </w:rPr>
-        <w:t xml:space="preserve"> data komentar</w:t>
+        <w:t xml:space="preserve"> data </w:t>
+      </w:r>
+      <w:proofErr w:type="gramStart"/>
+      <w:r>
+        <w:rPr>
+          <w:lang w:val="en-ID" w:eastAsia="en-ID"/>
+        </w:rPr>
+        <w:t>komentar</w:t>
       </w:r>
       <w:r>
         <w:rPr>
@@ -16711,6 +16972,7 @@
         </w:rPr>
         <w:t>.Feast</w:t>
       </w:r>
+      <w:proofErr w:type="gramEnd"/>
       <w:r>
         <w:rPr>
           <w:lang w:val="en-ID" w:eastAsia="en-ID"/>
@@ -16765,7 +17027,14 @@
         <w:rPr>
           <w:lang w:val="en-ID" w:eastAsia="en-ID"/>
         </w:rPr>
-        <w:t>eks komentar</w:t>
+        <w:t xml:space="preserve">eks </w:t>
+      </w:r>
+      <w:proofErr w:type="gramStart"/>
+      <w:r>
+        <w:rPr>
+          <w:lang w:val="en-ID" w:eastAsia="en-ID"/>
+        </w:rPr>
+        <w:t>komentar</w:t>
       </w:r>
       <w:r>
         <w:rPr>
@@ -16781,6 +17050,7 @@
         </w:rPr>
         <w:t>Feast</w:t>
       </w:r>
+      <w:proofErr w:type="gramEnd"/>
       <w:r>
         <w:rPr>
           <w:lang w:val="en-ID" w:eastAsia="en-ID"/>
@@ -16915,7 +17185,16 @@
           <w:highlight w:val="yellow"/>
           <w:lang w:val="en-ID" w:eastAsia="en-ID"/>
         </w:rPr>
-        <w:t>Data komentar diperoleh melalui teknik web scraping pada video musik resmi lagu "Arteri" oleh .</w:t>
+        <w:t xml:space="preserve">Data komentar diperoleh melalui teknik web scraping pada video musik resmi lagu "Arteri" </w:t>
+      </w:r>
+      <w:proofErr w:type="gramStart"/>
+      <w:r>
+        <w:rPr>
+          <w:rFonts w:eastAsia="Times New Roman"/>
+          <w:highlight w:val="yellow"/>
+          <w:lang w:val="en-ID" w:eastAsia="en-ID"/>
+        </w:rPr>
+        <w:t>oleh .</w:t>
       </w:r>
       <w:r>
         <w:rPr>
@@ -16937,6 +17216,7 @@
         </w:rPr>
         <w:t>east</w:t>
       </w:r>
+      <w:proofErr w:type="gramEnd"/>
       <w:r>
         <w:rPr>
           <w:rFonts w:eastAsia="Times New Roman"/>
@@ -19948,7 +20228,7 @@
 </file>
 
 <file path=word/endnotes.xml><?xml version="1.0" encoding="utf-8"?>
-<w:endnotes xmlns:wpc="http://schemas.microsoft.com/office/word/2010/wordprocessingCanvas" xmlns:cx="http://schemas.microsoft.com/office/drawing/2014/chartex" xmlns:cx1="http://schemas.microsoft.com/office/drawing/2015/9/8/chartex" xmlns:cx2="http://schemas.microsoft.com/office/drawing/2015/10/21/chartex" xmlns:cx3="http://schemas.microsoft.com/office/drawing/2016/5/9/chartex" xmlns:cx4="http://schemas.microsoft.com/office/drawing/2016/5/10/chartex" xmlns:cx5="http://schemas.microsoft.com/office/drawing/2016/5/11/chartex" xmlns:cx6="http://schemas.microsoft.com/office/drawing/2016/5/12/chartex" xmlns:cx7="http://schemas.microsoft.com/office/drawing/2016/5/13/chartex" xmlns:cx8="http://schemas.microsoft.com/office/drawing/2016/5/14/chartex" xmlns:mc="http://schemas.openxmlformats.org/markup-compatibility/2006" xmlns:aink="http://schemas.microsoft.com/office/drawing/2016/ink" xmlns:am3d="http://schemas.microsoft.com/office/drawing/2017/model3d" xmlns:o="urn:schemas-microsoft-com:office:office" xmlns:r="http://schemas.openxmlformats.org/officeDocument/2006/relationships" xmlns:m="http://schemas.openxmlformats.org/officeDocument/2006/math" xmlns:v="urn:schemas-microsoft-com:vml" xmlns:wp14="http://schemas.microsoft.com/office/word/2010/wordprocessingDrawing" xmlns:wp="http://schemas.openxmlformats.org/drawingml/2006/wordprocessingDrawing" xmlns:w10="urn:schemas-microsoft-com:office:word" xmlns:w="http://schemas.openxmlformats.org/wordprocessingml/2006/main" xmlns:w14="http://schemas.microsoft.com/office/word/2010/wordml" xmlns:w15="http://schemas.microsoft.com/office/word/2012/wordml" xmlns:w16cex="http://schemas.microsoft.com/office/word/2018/wordml/cex" xmlns:w16cid="http://schemas.microsoft.com/office/word/2016/wordml/cid" xmlns:w16="http://schemas.microsoft.com/office/word/2018/wordml" xmlns:w16sdtdh="http://schemas.microsoft.com/office/word/2020/wordml/sdtdatahash" xmlns:w16se="http://schemas.microsoft.com/office/word/2015/wordml/symex" xmlns:wpg="http://schemas.microsoft.com/office/word/2010/wordprocessingGroup" xmlns:wpi="http://schemas.microsoft.com/office/word/2010/wordprocessingInk" xmlns:wne="http://schemas.microsoft.com/office/word/2006/wordml" xmlns:wps="http://schemas.microsoft.com/office/word/2010/wordprocessingShape" mc:Ignorable="w14 w15 w16se w16cid w16 w16cex w16sdtdh wp14">
+<w:endnotes xmlns:wpc="http://schemas.microsoft.com/office/word/2010/wordprocessingCanvas" xmlns:cx="http://schemas.microsoft.com/office/drawing/2014/chartex" xmlns:cx1="http://schemas.microsoft.com/office/drawing/2015/9/8/chartex" xmlns:cx2="http://schemas.microsoft.com/office/drawing/2015/10/21/chartex" xmlns:cx3="http://schemas.microsoft.com/office/drawing/2016/5/9/chartex" xmlns:cx4="http://schemas.microsoft.com/office/drawing/2016/5/10/chartex" xmlns:cx5="http://schemas.microsoft.com/office/drawing/2016/5/11/chartex" xmlns:cx6="http://schemas.microsoft.com/office/drawing/2016/5/12/chartex" xmlns:cx7="http://schemas.microsoft.com/office/drawing/2016/5/13/chartex" xmlns:cx8="http://schemas.microsoft.com/office/drawing/2016/5/14/chartex" xmlns:mc="http://schemas.openxmlformats.org/markup-compatibility/2006" xmlns:aink="http://schemas.microsoft.com/office/drawing/2016/ink" xmlns:am3d="http://schemas.microsoft.com/office/drawing/2017/model3d" xmlns:o="urn:schemas-microsoft-com:office:office" xmlns:oel="http://schemas.microsoft.com/office/2019/extlst" xmlns:r="http://schemas.openxmlformats.org/officeDocument/2006/relationships" xmlns:m="http://schemas.openxmlformats.org/officeDocument/2006/math" xmlns:v="urn:schemas-microsoft-com:vml" xmlns:wp14="http://schemas.microsoft.com/office/word/2010/wordprocessingDrawing" xmlns:wp="http://schemas.openxmlformats.org/drawingml/2006/wordprocessingDrawing" xmlns:w10="urn:schemas-microsoft-com:office:word" xmlns:w="http://schemas.openxmlformats.org/wordprocessingml/2006/main" xmlns:w14="http://schemas.microsoft.com/office/word/2010/wordml" xmlns:w15="http://schemas.microsoft.com/office/word/2012/wordml" xmlns:w16cex="http://schemas.microsoft.com/office/word/2018/wordml/cex" xmlns:w16cid="http://schemas.microsoft.com/office/word/2016/wordml/cid" xmlns:w16="http://schemas.microsoft.com/office/word/2018/wordml" xmlns:w16du="http://schemas.microsoft.com/office/word/2023/wordml/word16du" xmlns:w16sdtdh="http://schemas.microsoft.com/office/word/2020/wordml/sdtdatahash" xmlns:w16sdtfl="http://schemas.microsoft.com/office/word/2024/wordml/sdtformatlock" xmlns:w16se="http://schemas.microsoft.com/office/word/2015/wordml/symex" xmlns:wpg="http://schemas.microsoft.com/office/word/2010/wordprocessingGroup" xmlns:wpi="http://schemas.microsoft.com/office/word/2010/wordprocessingInk" xmlns:wne="http://schemas.microsoft.com/office/word/2006/wordml" xmlns:wps="http://schemas.microsoft.com/office/word/2010/wordprocessingShape" mc:Ignorable="w14 w15 w16se w16cid w16 w16cex w16sdtdh w16sdtfl w16du wp14">
   <w:endnote w:type="separator" w:id="-1">
     <w:p>
       <w:pPr>
@@ -19973,7 +20253,7 @@
 </file>
 
 <file path=word/footer1.xml><?xml version="1.0" encoding="utf-8"?>
-<w:ftr xmlns:wpc="http://schemas.microsoft.com/office/word/2010/wordprocessingCanvas" xmlns:cx="http://schemas.microsoft.com/office/drawing/2014/chartex" xmlns:cx1="http://schemas.microsoft.com/office/drawing/2015/9/8/chartex" xmlns:cx2="http://schemas.microsoft.com/office/drawing/2015/10/21/chartex" xmlns:cx3="http://schemas.microsoft.com/office/drawing/2016/5/9/chartex" xmlns:cx4="http://schemas.microsoft.com/office/drawing/2016/5/10/chartex" xmlns:cx5="http://schemas.microsoft.com/office/drawing/2016/5/11/chartex" xmlns:cx6="http://schemas.microsoft.com/office/drawing/2016/5/12/chartex" xmlns:cx7="http://schemas.microsoft.com/office/drawing/2016/5/13/chartex" xmlns:cx8="http://schemas.microsoft.com/office/drawing/2016/5/14/chartex" xmlns:mc="http://schemas.openxmlformats.org/markup-compatibility/2006" xmlns:aink="http://schemas.microsoft.com/office/drawing/2016/ink" xmlns:am3d="http://schemas.microsoft.com/office/drawing/2017/model3d" xmlns:o="urn:schemas-microsoft-com:office:office" xmlns:r="http://schemas.openxmlformats.org/officeDocument/2006/relationships" xmlns:m="http://schemas.openxmlformats.org/officeDocument/2006/math" xmlns:v="urn:schemas-microsoft-com:vml" xmlns:wp14="http://schemas.microsoft.com/office/word/2010/wordprocessingDrawing" xmlns:wp="http://schemas.openxmlformats.org/drawingml/2006/wordprocessingDrawing" xmlns:w10="urn:schemas-microsoft-com:office:word" xmlns:w="http://schemas.openxmlformats.org/wordprocessingml/2006/main" xmlns:w14="http://schemas.microsoft.com/office/word/2010/wordml" xmlns:w15="http://schemas.microsoft.com/office/word/2012/wordml" xmlns:w16cex="http://schemas.microsoft.com/office/word/2018/wordml/cex" xmlns:w16cid="http://schemas.microsoft.com/office/word/2016/wordml/cid" xmlns:w16="http://schemas.microsoft.com/office/word/2018/wordml" xmlns:w16sdtdh="http://schemas.microsoft.com/office/word/2020/wordml/sdtdatahash" xmlns:w16se="http://schemas.microsoft.com/office/word/2015/wordml/symex" xmlns:wpg="http://schemas.microsoft.com/office/word/2010/wordprocessingGroup" xmlns:wpi="http://schemas.microsoft.com/office/word/2010/wordprocessingInk" xmlns:wne="http://schemas.microsoft.com/office/word/2006/wordml" xmlns:wps="http://schemas.microsoft.com/office/word/2010/wordprocessingShape" mc:Ignorable="w14 w15 w16se w16cid w16 w16cex w16sdtdh wp14">
+<w:ftr xmlns:wpc="http://schemas.microsoft.com/office/word/2010/wordprocessingCanvas" xmlns:cx="http://schemas.microsoft.com/office/drawing/2014/chartex" xmlns:cx1="http://schemas.microsoft.com/office/drawing/2015/9/8/chartex" xmlns:cx2="http://schemas.microsoft.com/office/drawing/2015/10/21/chartex" xmlns:cx3="http://schemas.microsoft.com/office/drawing/2016/5/9/chartex" xmlns:cx4="http://schemas.microsoft.com/office/drawing/2016/5/10/chartex" xmlns:cx5="http://schemas.microsoft.com/office/drawing/2016/5/11/chartex" xmlns:cx6="http://schemas.microsoft.com/office/drawing/2016/5/12/chartex" xmlns:cx7="http://schemas.microsoft.com/office/drawing/2016/5/13/chartex" xmlns:cx8="http://schemas.microsoft.com/office/drawing/2016/5/14/chartex" xmlns:mc="http://schemas.openxmlformats.org/markup-compatibility/2006" xmlns:aink="http://schemas.microsoft.com/office/drawing/2016/ink" xmlns:am3d="http://schemas.microsoft.com/office/drawing/2017/model3d" xmlns:o="urn:schemas-microsoft-com:office:office" xmlns:oel="http://schemas.microsoft.com/office/2019/extlst" xmlns:r="http://schemas.openxmlformats.org/officeDocument/2006/relationships" xmlns:m="http://schemas.openxmlformats.org/officeDocument/2006/math" xmlns:v="urn:schemas-microsoft-com:vml" xmlns:wp14="http://schemas.microsoft.com/office/word/2010/wordprocessingDrawing" xmlns:wp="http://schemas.openxmlformats.org/drawingml/2006/wordprocessingDrawing" xmlns:w10="urn:schemas-microsoft-com:office:word" xmlns:w="http://schemas.openxmlformats.org/wordprocessingml/2006/main" xmlns:w14="http://schemas.microsoft.com/office/word/2010/wordml" xmlns:w15="http://schemas.microsoft.com/office/word/2012/wordml" xmlns:w16cex="http://schemas.microsoft.com/office/word/2018/wordml/cex" xmlns:w16cid="http://schemas.microsoft.com/office/word/2016/wordml/cid" xmlns:w16="http://schemas.microsoft.com/office/word/2018/wordml" xmlns:w16du="http://schemas.microsoft.com/office/word/2023/wordml/word16du" xmlns:w16sdtdh="http://schemas.microsoft.com/office/word/2020/wordml/sdtdatahash" xmlns:w16sdtfl="http://schemas.microsoft.com/office/word/2024/wordml/sdtformatlock" xmlns:w16se="http://schemas.microsoft.com/office/word/2015/wordml/symex" xmlns:wpg="http://schemas.microsoft.com/office/word/2010/wordprocessingGroup" xmlns:wpi="http://schemas.microsoft.com/office/word/2010/wordprocessingInk" xmlns:wne="http://schemas.microsoft.com/office/word/2006/wordml" xmlns:wps="http://schemas.microsoft.com/office/word/2010/wordprocessingShape" mc:Ignorable="w14 w15 w16se w16cid w16 w16cex w16sdtdh w16sdtfl w16du wp14">
   <w:p>
     <w:pPr>
       <w:pStyle w:val="Footer"/>
@@ -19989,7 +20269,7 @@
 </file>
 
 <file path=word/footer2.xml><?xml version="1.0" encoding="utf-8"?>
-<w:ftr xmlns:wpc="http://schemas.microsoft.com/office/word/2010/wordprocessingCanvas" xmlns:cx="http://schemas.microsoft.com/office/drawing/2014/chartex" xmlns:cx1="http://schemas.microsoft.com/office/drawing/2015/9/8/chartex" xmlns:cx2="http://schemas.microsoft.com/office/drawing/2015/10/21/chartex" xmlns:cx3="http://schemas.microsoft.com/office/drawing/2016/5/9/chartex" xmlns:cx4="http://schemas.microsoft.com/office/drawing/2016/5/10/chartex" xmlns:cx5="http://schemas.microsoft.com/office/drawing/2016/5/11/chartex" xmlns:cx6="http://schemas.microsoft.com/office/drawing/2016/5/12/chartex" xmlns:cx7="http://schemas.microsoft.com/office/drawing/2016/5/13/chartex" xmlns:cx8="http://schemas.microsoft.com/office/drawing/2016/5/14/chartex" xmlns:mc="http://schemas.openxmlformats.org/markup-compatibility/2006" xmlns:aink="http://schemas.microsoft.com/office/drawing/2016/ink" xmlns:am3d="http://schemas.microsoft.com/office/drawing/2017/model3d" xmlns:o="urn:schemas-microsoft-com:office:office" xmlns:r="http://schemas.openxmlformats.org/officeDocument/2006/relationships" xmlns:m="http://schemas.openxmlformats.org/officeDocument/2006/math" xmlns:v="urn:schemas-microsoft-com:vml" xmlns:wp14="http://schemas.microsoft.com/office/word/2010/wordprocessingDrawing" xmlns:wp="http://schemas.openxmlformats.org/drawingml/2006/wordprocessingDrawing" xmlns:w10="urn:schemas-microsoft-com:office:word" xmlns:w="http://schemas.openxmlformats.org/wordprocessingml/2006/main" xmlns:w14="http://schemas.microsoft.com/office/word/2010/wordml" xmlns:w15="http://schemas.microsoft.com/office/word/2012/wordml" xmlns:w16cex="http://schemas.microsoft.com/office/word/2018/wordml/cex" xmlns:w16cid="http://schemas.microsoft.com/office/word/2016/wordml/cid" xmlns:w16="http://schemas.microsoft.com/office/word/2018/wordml" xmlns:w16sdtdh="http://schemas.microsoft.com/office/word/2020/wordml/sdtdatahash" xmlns:w16se="http://schemas.microsoft.com/office/word/2015/wordml/symex" xmlns:wpg="http://schemas.microsoft.com/office/word/2010/wordprocessingGroup" xmlns:wpi="http://schemas.microsoft.com/office/word/2010/wordprocessingInk" xmlns:wne="http://schemas.microsoft.com/office/word/2006/wordml" xmlns:wps="http://schemas.microsoft.com/office/word/2010/wordprocessingShape" mc:Ignorable="w14 w15 w16se w16cid w16 w16cex w16sdtdh wp14">
+<w:ftr xmlns:wpc="http://schemas.microsoft.com/office/word/2010/wordprocessingCanvas" xmlns:cx="http://schemas.microsoft.com/office/drawing/2014/chartex" xmlns:cx1="http://schemas.microsoft.com/office/drawing/2015/9/8/chartex" xmlns:cx2="http://schemas.microsoft.com/office/drawing/2015/10/21/chartex" xmlns:cx3="http://schemas.microsoft.com/office/drawing/2016/5/9/chartex" xmlns:cx4="http://schemas.microsoft.com/office/drawing/2016/5/10/chartex" xmlns:cx5="http://schemas.microsoft.com/office/drawing/2016/5/11/chartex" xmlns:cx6="http://schemas.microsoft.com/office/drawing/2016/5/12/chartex" xmlns:cx7="http://schemas.microsoft.com/office/drawing/2016/5/13/chartex" xmlns:cx8="http://schemas.microsoft.com/office/drawing/2016/5/14/chartex" xmlns:mc="http://schemas.openxmlformats.org/markup-compatibility/2006" xmlns:aink="http://schemas.microsoft.com/office/drawing/2016/ink" xmlns:am3d="http://schemas.microsoft.com/office/drawing/2017/model3d" xmlns:o="urn:schemas-microsoft-com:office:office" xmlns:oel="http://schemas.microsoft.com/office/2019/extlst" xmlns:r="http://schemas.openxmlformats.org/officeDocument/2006/relationships" xmlns:m="http://schemas.openxmlformats.org/officeDocument/2006/math" xmlns:v="urn:schemas-microsoft-com:vml" xmlns:wp14="http://schemas.microsoft.com/office/word/2010/wordprocessingDrawing" xmlns:wp="http://schemas.openxmlformats.org/drawingml/2006/wordprocessingDrawing" xmlns:w10="urn:schemas-microsoft-com:office:word" xmlns:w="http://schemas.openxmlformats.org/wordprocessingml/2006/main" xmlns:w14="http://schemas.microsoft.com/office/word/2010/wordml" xmlns:w15="http://schemas.microsoft.com/office/word/2012/wordml" xmlns:w16cex="http://schemas.microsoft.com/office/word/2018/wordml/cex" xmlns:w16cid="http://schemas.microsoft.com/office/word/2016/wordml/cid" xmlns:w16="http://schemas.microsoft.com/office/word/2018/wordml" xmlns:w16du="http://schemas.microsoft.com/office/word/2023/wordml/word16du" xmlns:w16sdtdh="http://schemas.microsoft.com/office/word/2020/wordml/sdtdatahash" xmlns:w16sdtfl="http://schemas.microsoft.com/office/word/2024/wordml/sdtformatlock" xmlns:w16se="http://schemas.microsoft.com/office/word/2015/wordml/symex" xmlns:wpg="http://schemas.microsoft.com/office/word/2010/wordprocessingGroup" xmlns:wpi="http://schemas.microsoft.com/office/word/2010/wordprocessingInk" xmlns:wne="http://schemas.microsoft.com/office/word/2006/wordml" xmlns:wps="http://schemas.microsoft.com/office/word/2010/wordprocessingShape" mc:Ignorable="w14 w15 w16se w16cid w16 w16cex w16sdtdh w16sdtfl w16du wp14">
   <w:sdt>
     <w:sdtPr>
       <w:id w:val="-1225991741"/>
@@ -20042,7 +20322,7 @@
 </file>
 
 <file path=word/footnotes.xml><?xml version="1.0" encoding="utf-8"?>
-<w:footnotes xmlns:wpc="http://schemas.microsoft.com/office/word/2010/wordprocessingCanvas" xmlns:cx="http://schemas.microsoft.com/office/drawing/2014/chartex" xmlns:cx1="http://schemas.microsoft.com/office/drawing/2015/9/8/chartex" xmlns:cx2="http://schemas.microsoft.com/office/drawing/2015/10/21/chartex" xmlns:cx3="http://schemas.microsoft.com/office/drawing/2016/5/9/chartex" xmlns:cx4="http://schemas.microsoft.com/office/drawing/2016/5/10/chartex" xmlns:cx5="http://schemas.microsoft.com/office/drawing/2016/5/11/chartex" xmlns:cx6="http://schemas.microsoft.com/office/drawing/2016/5/12/chartex" xmlns:cx7="http://schemas.microsoft.com/office/drawing/2016/5/13/chartex" xmlns:cx8="http://schemas.microsoft.com/office/drawing/2016/5/14/chartex" xmlns:mc="http://schemas.openxmlformats.org/markup-compatibility/2006" xmlns:aink="http://schemas.microsoft.com/office/drawing/2016/ink" xmlns:am3d="http://schemas.microsoft.com/office/drawing/2017/model3d" xmlns:o="urn:schemas-microsoft-com:office:office" xmlns:r="http://schemas.openxmlformats.org/officeDocument/2006/relationships" xmlns:m="http://schemas.openxmlformats.org/officeDocument/2006/math" xmlns:v="urn:schemas-microsoft-com:vml" xmlns:wp14="http://schemas.microsoft.com/office/word/2010/wordprocessingDrawing" xmlns:wp="http://schemas.openxmlformats.org/drawingml/2006/wordprocessingDrawing" xmlns:w10="urn:schemas-microsoft-com:office:word" xmlns:w="http://schemas.openxmlformats.org/wordprocessingml/2006/main" xmlns:w14="http://schemas.microsoft.com/office/word/2010/wordml" xmlns:w15="http://schemas.microsoft.com/office/word/2012/wordml" xmlns:w16cex="http://schemas.microsoft.com/office/word/2018/wordml/cex" xmlns:w16cid="http://schemas.microsoft.com/office/word/2016/wordml/cid" xmlns:w16="http://schemas.microsoft.com/office/word/2018/wordml" xmlns:w16sdtdh="http://schemas.microsoft.com/office/word/2020/wordml/sdtdatahash" xmlns:w16se="http://schemas.microsoft.com/office/word/2015/wordml/symex" xmlns:wpg="http://schemas.microsoft.com/office/word/2010/wordprocessingGroup" xmlns:wpi="http://schemas.microsoft.com/office/word/2010/wordprocessingInk" xmlns:wne="http://schemas.microsoft.com/office/word/2006/wordml" xmlns:wps="http://schemas.microsoft.com/office/word/2010/wordprocessingShape" mc:Ignorable="w14 w15 w16se w16cid w16 w16cex w16sdtdh wp14">
+<w:footnotes xmlns:wpc="http://schemas.microsoft.com/office/word/2010/wordprocessingCanvas" xmlns:cx="http://schemas.microsoft.com/office/drawing/2014/chartex" xmlns:cx1="http://schemas.microsoft.com/office/drawing/2015/9/8/chartex" xmlns:cx2="http://schemas.microsoft.com/office/drawing/2015/10/21/chartex" xmlns:cx3="http://schemas.microsoft.com/office/drawing/2016/5/9/chartex" xmlns:cx4="http://schemas.microsoft.com/office/drawing/2016/5/10/chartex" xmlns:cx5="http://schemas.microsoft.com/office/drawing/2016/5/11/chartex" xmlns:cx6="http://schemas.microsoft.com/office/drawing/2016/5/12/chartex" xmlns:cx7="http://schemas.microsoft.com/office/drawing/2016/5/13/chartex" xmlns:cx8="http://schemas.microsoft.com/office/drawing/2016/5/14/chartex" xmlns:mc="http://schemas.openxmlformats.org/markup-compatibility/2006" xmlns:aink="http://schemas.microsoft.com/office/drawing/2016/ink" xmlns:am3d="http://schemas.microsoft.com/office/drawing/2017/model3d" xmlns:o="urn:schemas-microsoft-com:office:office" xmlns:oel="http://schemas.microsoft.com/office/2019/extlst" xmlns:r="http://schemas.openxmlformats.org/officeDocument/2006/relationships" xmlns:m="http://schemas.openxmlformats.org/officeDocument/2006/math" xmlns:v="urn:schemas-microsoft-com:vml" xmlns:wp14="http://schemas.microsoft.com/office/word/2010/wordprocessingDrawing" xmlns:wp="http://schemas.openxmlformats.org/drawingml/2006/wordprocessingDrawing" xmlns:w10="urn:schemas-microsoft-com:office:word" xmlns:w="http://schemas.openxmlformats.org/wordprocessingml/2006/main" xmlns:w14="http://schemas.microsoft.com/office/word/2010/wordml" xmlns:w15="http://schemas.microsoft.com/office/word/2012/wordml" xmlns:w16cex="http://schemas.microsoft.com/office/word/2018/wordml/cex" xmlns:w16cid="http://schemas.microsoft.com/office/word/2016/wordml/cid" xmlns:w16="http://schemas.microsoft.com/office/word/2018/wordml" xmlns:w16du="http://schemas.microsoft.com/office/word/2023/wordml/word16du" xmlns:w16sdtdh="http://schemas.microsoft.com/office/word/2020/wordml/sdtdatahash" xmlns:w16sdtfl="http://schemas.microsoft.com/office/word/2024/wordml/sdtformatlock" xmlns:w16se="http://schemas.microsoft.com/office/word/2015/wordml/symex" xmlns:wpg="http://schemas.microsoft.com/office/word/2010/wordprocessingGroup" xmlns:wpi="http://schemas.microsoft.com/office/word/2010/wordprocessingInk" xmlns:wne="http://schemas.microsoft.com/office/word/2006/wordml" xmlns:wps="http://schemas.microsoft.com/office/word/2010/wordprocessingShape" mc:Ignorable="w14 w15 w16se w16cid w16 w16cex w16sdtdh w16sdtfl w16du wp14">
   <w:footnote w:type="separator" w:id="-1">
     <w:p>
       <w:pPr>
@@ -20067,7 +20347,7 @@
 </file>
 
 <file path=word/header1.xml><?xml version="1.0" encoding="utf-8"?>
-<w:hdr xmlns:wpc="http://schemas.microsoft.com/office/word/2010/wordprocessingCanvas" xmlns:cx="http://schemas.microsoft.com/office/drawing/2014/chartex" xmlns:cx1="http://schemas.microsoft.com/office/drawing/2015/9/8/chartex" xmlns:cx2="http://schemas.microsoft.com/office/drawing/2015/10/21/chartex" xmlns:cx3="http://schemas.microsoft.com/office/drawing/2016/5/9/chartex" xmlns:cx4="http://schemas.microsoft.com/office/drawing/2016/5/10/chartex" xmlns:cx5="http://schemas.microsoft.com/office/drawing/2016/5/11/chartex" xmlns:cx6="http://schemas.microsoft.com/office/drawing/2016/5/12/chartex" xmlns:cx7="http://schemas.microsoft.com/office/drawing/2016/5/13/chartex" xmlns:cx8="http://schemas.microsoft.com/office/drawing/2016/5/14/chartex" xmlns:mc="http://schemas.openxmlformats.org/markup-compatibility/2006" xmlns:aink="http://schemas.microsoft.com/office/drawing/2016/ink" xmlns:am3d="http://schemas.microsoft.com/office/drawing/2017/model3d" xmlns:o="urn:schemas-microsoft-com:office:office" xmlns:r="http://schemas.openxmlformats.org/officeDocument/2006/relationships" xmlns:m="http://schemas.openxmlformats.org/officeDocument/2006/math" xmlns:v="urn:schemas-microsoft-com:vml" xmlns:wp14="http://schemas.microsoft.com/office/word/2010/wordprocessingDrawing" xmlns:wp="http://schemas.openxmlformats.org/drawingml/2006/wordprocessingDrawing" xmlns:w10="urn:schemas-microsoft-com:office:word" xmlns:w="http://schemas.openxmlformats.org/wordprocessingml/2006/main" xmlns:w14="http://schemas.microsoft.com/office/word/2010/wordml" xmlns:w15="http://schemas.microsoft.com/office/word/2012/wordml" xmlns:w16cex="http://schemas.microsoft.com/office/word/2018/wordml/cex" xmlns:w16cid="http://schemas.microsoft.com/office/word/2016/wordml/cid" xmlns:w16="http://schemas.microsoft.com/office/word/2018/wordml" xmlns:w16sdtdh="http://schemas.microsoft.com/office/word/2020/wordml/sdtdatahash" xmlns:w16se="http://schemas.microsoft.com/office/word/2015/wordml/symex" xmlns:wpg="http://schemas.microsoft.com/office/word/2010/wordprocessingGroup" xmlns:wpi="http://schemas.microsoft.com/office/word/2010/wordprocessingInk" xmlns:wne="http://schemas.microsoft.com/office/word/2006/wordml" xmlns:wps="http://schemas.microsoft.com/office/word/2010/wordprocessingShape" mc:Ignorable="w14 w15 w16se w16cid w16 w16cex w16sdtdh wp14">
+<w:hdr xmlns:wpc="http://schemas.microsoft.com/office/word/2010/wordprocessingCanvas" xmlns:cx="http://schemas.microsoft.com/office/drawing/2014/chartex" xmlns:cx1="http://schemas.microsoft.com/office/drawing/2015/9/8/chartex" xmlns:cx2="http://schemas.microsoft.com/office/drawing/2015/10/21/chartex" xmlns:cx3="http://schemas.microsoft.com/office/drawing/2016/5/9/chartex" xmlns:cx4="http://schemas.microsoft.com/office/drawing/2016/5/10/chartex" xmlns:cx5="http://schemas.microsoft.com/office/drawing/2016/5/11/chartex" xmlns:cx6="http://schemas.microsoft.com/office/drawing/2016/5/12/chartex" xmlns:cx7="http://schemas.microsoft.com/office/drawing/2016/5/13/chartex" xmlns:cx8="http://schemas.microsoft.com/office/drawing/2016/5/14/chartex" xmlns:mc="http://schemas.openxmlformats.org/markup-compatibility/2006" xmlns:aink="http://schemas.microsoft.com/office/drawing/2016/ink" xmlns:am3d="http://schemas.microsoft.com/office/drawing/2017/model3d" xmlns:o="urn:schemas-microsoft-com:office:office" xmlns:oel="http://schemas.microsoft.com/office/2019/extlst" xmlns:r="http://schemas.openxmlformats.org/officeDocument/2006/relationships" xmlns:m="http://schemas.openxmlformats.org/officeDocument/2006/math" xmlns:v="urn:schemas-microsoft-com:vml" xmlns:wp14="http://schemas.microsoft.com/office/word/2010/wordprocessingDrawing" xmlns:wp="http://schemas.openxmlformats.org/drawingml/2006/wordprocessingDrawing" xmlns:w10="urn:schemas-microsoft-com:office:word" xmlns:w="http://schemas.openxmlformats.org/wordprocessingml/2006/main" xmlns:w14="http://schemas.microsoft.com/office/word/2010/wordml" xmlns:w15="http://schemas.microsoft.com/office/word/2012/wordml" xmlns:w16cex="http://schemas.microsoft.com/office/word/2018/wordml/cex" xmlns:w16cid="http://schemas.microsoft.com/office/word/2016/wordml/cid" xmlns:w16="http://schemas.microsoft.com/office/word/2018/wordml" xmlns:w16du="http://schemas.microsoft.com/office/word/2023/wordml/word16du" xmlns:w16sdtdh="http://schemas.microsoft.com/office/word/2020/wordml/sdtdatahash" xmlns:w16sdtfl="http://schemas.microsoft.com/office/word/2024/wordml/sdtformatlock" xmlns:w16se="http://schemas.microsoft.com/office/word/2015/wordml/symex" xmlns:wpg="http://schemas.microsoft.com/office/word/2010/wordprocessingGroup" xmlns:wpi="http://schemas.microsoft.com/office/word/2010/wordprocessingInk" xmlns:wne="http://schemas.microsoft.com/office/word/2006/wordml" xmlns:wps="http://schemas.microsoft.com/office/word/2010/wordprocessingShape" mc:Ignorable="w14 w15 w16se w16cid w16 w16cex w16sdtdh w16sdtfl w16du wp14">
   <w:p>
     <w:pPr>
       <w:pStyle w:val="Header"/>
@@ -20077,7 +20357,7 @@
 </file>
 
 <file path=word/numbering.xml><?xml version="1.0" encoding="utf-8"?>
-<w:numbering xmlns:wpc="http://schemas.microsoft.com/office/word/2010/wordprocessingCanvas" xmlns:cx="http://schemas.microsoft.com/office/drawing/2014/chartex" xmlns:cx1="http://schemas.microsoft.com/office/drawing/2015/9/8/chartex" xmlns:cx2="http://schemas.microsoft.com/office/drawing/2015/10/21/chartex" xmlns:cx3="http://schemas.microsoft.com/office/drawing/2016/5/9/chartex" xmlns:cx4="http://schemas.microsoft.com/office/drawing/2016/5/10/chartex" xmlns:cx5="http://schemas.microsoft.com/office/drawing/2016/5/11/chartex" xmlns:cx6="http://schemas.microsoft.com/office/drawing/2016/5/12/chartex" xmlns:cx7="http://schemas.microsoft.com/office/drawing/2016/5/13/chartex" xmlns:cx8="http://schemas.microsoft.com/office/drawing/2016/5/14/chartex" xmlns:mc="http://schemas.openxmlformats.org/markup-compatibility/2006" xmlns:aink="http://schemas.microsoft.com/office/drawing/2016/ink" xmlns:am3d="http://schemas.microsoft.com/office/drawing/2017/model3d" xmlns:o="urn:schemas-microsoft-com:office:office" xmlns:r="http://schemas.openxmlformats.org/officeDocument/2006/relationships" xmlns:m="http://schemas.openxmlformats.org/officeDocument/2006/math" xmlns:v="urn:schemas-microsoft-com:vml" xmlns:wp14="http://schemas.microsoft.com/office/word/2010/wordprocessingDrawing" xmlns:wp="http://schemas.openxmlformats.org/drawingml/2006/wordprocessingDrawing" xmlns:w10="urn:schemas-microsoft-com:office:word" xmlns:w="http://schemas.openxmlformats.org/wordprocessingml/2006/main" xmlns:w14="http://schemas.microsoft.com/office/word/2010/wordml" xmlns:w15="http://schemas.microsoft.com/office/word/2012/wordml" xmlns:w16cex="http://schemas.microsoft.com/office/word/2018/wordml/cex" xmlns:w16cid="http://schemas.microsoft.com/office/word/2016/wordml/cid" xmlns:w16="http://schemas.microsoft.com/office/word/2018/wordml" xmlns:w16sdtdh="http://schemas.microsoft.com/office/word/2020/wordml/sdtdatahash" xmlns:w16se="http://schemas.microsoft.com/office/word/2015/wordml/symex" xmlns:wpg="http://schemas.microsoft.com/office/word/2010/wordprocessingGroup" xmlns:wpi="http://schemas.microsoft.com/office/word/2010/wordprocessingInk" xmlns:wne="http://schemas.microsoft.com/office/word/2006/wordml" xmlns:wps="http://schemas.microsoft.com/office/word/2010/wordprocessingShape" mc:Ignorable="w14 w15 w16se w16cid w16 w16cex w16sdtdh wp14">
+<w:numbering xmlns:wpc="http://schemas.microsoft.com/office/word/2010/wordprocessingCanvas" xmlns:cx="http://schemas.microsoft.com/office/drawing/2014/chartex" xmlns:cx1="http://schemas.microsoft.com/office/drawing/2015/9/8/chartex" xmlns:cx2="http://schemas.microsoft.com/office/drawing/2015/10/21/chartex" xmlns:cx3="http://schemas.microsoft.com/office/drawing/2016/5/9/chartex" xmlns:cx4="http://schemas.microsoft.com/office/drawing/2016/5/10/chartex" xmlns:cx5="http://schemas.microsoft.com/office/drawing/2016/5/11/chartex" xmlns:cx6="http://schemas.microsoft.com/office/drawing/2016/5/12/chartex" xmlns:cx7="http://schemas.microsoft.com/office/drawing/2016/5/13/chartex" xmlns:cx8="http://schemas.microsoft.com/office/drawing/2016/5/14/chartex" xmlns:mc="http://schemas.openxmlformats.org/markup-compatibility/2006" xmlns:aink="http://schemas.microsoft.com/office/drawing/2016/ink" xmlns:am3d="http://schemas.microsoft.com/office/drawing/2017/model3d" xmlns:o="urn:schemas-microsoft-com:office:office" xmlns:oel="http://schemas.microsoft.com/office/2019/extlst" xmlns:r="http://schemas.openxmlformats.org/officeDocument/2006/relationships" xmlns:m="http://schemas.openxmlformats.org/officeDocument/2006/math" xmlns:v="urn:schemas-microsoft-com:vml" xmlns:wp14="http://schemas.microsoft.com/office/word/2010/wordprocessingDrawing" xmlns:wp="http://schemas.openxmlformats.org/drawingml/2006/wordprocessingDrawing" xmlns:w10="urn:schemas-microsoft-com:office:word" xmlns:w="http://schemas.openxmlformats.org/wordprocessingml/2006/main" xmlns:w14="http://schemas.microsoft.com/office/word/2010/wordml" xmlns:w15="http://schemas.microsoft.com/office/word/2012/wordml" xmlns:w16cex="http://schemas.microsoft.com/office/word/2018/wordml/cex" xmlns:w16cid="http://schemas.microsoft.com/office/word/2016/wordml/cid" xmlns:w16="http://schemas.microsoft.com/office/word/2018/wordml" xmlns:w16du="http://schemas.microsoft.com/office/word/2023/wordml/word16du" xmlns:w16sdtdh="http://schemas.microsoft.com/office/word/2020/wordml/sdtdatahash" xmlns:w16sdtfl="http://schemas.microsoft.com/office/word/2024/wordml/sdtformatlock" xmlns:w16se="http://schemas.microsoft.com/office/word/2015/wordml/symex" xmlns:wpg="http://schemas.microsoft.com/office/word/2010/wordprocessingGroup" xmlns:wpi="http://schemas.microsoft.com/office/word/2010/wordprocessingInk" xmlns:wne="http://schemas.microsoft.com/office/word/2006/wordml" xmlns:wps="http://schemas.microsoft.com/office/word/2010/wordprocessingShape" mc:Ignorable="w14 w15 w16se w16cid w16 w16cex w16sdtdh w16sdtfl w16du wp14">
   <w:abstractNum w:abstractNumId="0" w15:restartNumberingAfterBreak="0">
     <w:nsid w:val="0DDF46C8"/>
     <w:multiLevelType w:val="hybridMultilevel"/>
@@ -23946,137 +24226,137 @@
       </w:pPr>
     </w:lvl>
   </w:abstractNum>
-  <w:num w:numId="1">
+  <w:num w:numId="1" w16cid:durableId="473447378">
     <w:abstractNumId w:val="35"/>
   </w:num>
-  <w:num w:numId="2">
+  <w:num w:numId="2" w16cid:durableId="650133343">
     <w:abstractNumId w:val="39"/>
   </w:num>
-  <w:num w:numId="3">
+  <w:num w:numId="3" w16cid:durableId="976571045">
     <w:abstractNumId w:val="8"/>
   </w:num>
-  <w:num w:numId="4">
+  <w:num w:numId="4" w16cid:durableId="489709389">
     <w:abstractNumId w:val="6"/>
   </w:num>
-  <w:num w:numId="5">
+  <w:num w:numId="5" w16cid:durableId="672343334">
     <w:abstractNumId w:val="36"/>
   </w:num>
-  <w:num w:numId="6">
+  <w:num w:numId="6" w16cid:durableId="666249117">
     <w:abstractNumId w:val="24"/>
   </w:num>
-  <w:num w:numId="7">
+  <w:num w:numId="7" w16cid:durableId="898247141">
     <w:abstractNumId w:val="25"/>
   </w:num>
-  <w:num w:numId="8">
+  <w:num w:numId="8" w16cid:durableId="2049180830">
     <w:abstractNumId w:val="21"/>
   </w:num>
-  <w:num w:numId="9">
+  <w:num w:numId="9" w16cid:durableId="599409963">
     <w:abstractNumId w:val="13"/>
   </w:num>
-  <w:num w:numId="10">
+  <w:num w:numId="10" w16cid:durableId="290135547">
     <w:abstractNumId w:val="31"/>
   </w:num>
-  <w:num w:numId="11">
+  <w:num w:numId="11" w16cid:durableId="740716605">
     <w:abstractNumId w:val="28"/>
   </w:num>
-  <w:num w:numId="12">
+  <w:num w:numId="12" w16cid:durableId="774444166">
     <w:abstractNumId w:val="15"/>
   </w:num>
-  <w:num w:numId="13">
+  <w:num w:numId="13" w16cid:durableId="2060665351">
     <w:abstractNumId w:val="18"/>
   </w:num>
-  <w:num w:numId="14">
+  <w:num w:numId="14" w16cid:durableId="685133755">
     <w:abstractNumId w:val="17"/>
   </w:num>
-  <w:num w:numId="15">
+  <w:num w:numId="15" w16cid:durableId="957567178">
     <w:abstractNumId w:val="3"/>
   </w:num>
-  <w:num w:numId="16">
+  <w:num w:numId="16" w16cid:durableId="154155411">
     <w:abstractNumId w:val="35"/>
     <w:lvlOverride w:ilvl="0">
       <w:startOverride w:val="1"/>
     </w:lvlOverride>
   </w:num>
-  <w:num w:numId="17">
+  <w:num w:numId="17" w16cid:durableId="1616137736">
     <w:abstractNumId w:val="7"/>
   </w:num>
-  <w:num w:numId="18">
+  <w:num w:numId="18" w16cid:durableId="243610511">
     <w:abstractNumId w:val="0"/>
   </w:num>
-  <w:num w:numId="19">
+  <w:num w:numId="19" w16cid:durableId="803740273">
     <w:abstractNumId w:val="37"/>
   </w:num>
-  <w:num w:numId="20">
+  <w:num w:numId="20" w16cid:durableId="642927956">
     <w:abstractNumId w:val="10"/>
   </w:num>
-  <w:num w:numId="21">
+  <w:num w:numId="21" w16cid:durableId="373818254">
     <w:abstractNumId w:val="33"/>
   </w:num>
-  <w:num w:numId="22">
+  <w:num w:numId="22" w16cid:durableId="1729258422">
     <w:abstractNumId w:val="12"/>
   </w:num>
-  <w:num w:numId="23">
+  <w:num w:numId="23" w16cid:durableId="1934849519">
     <w:abstractNumId w:val="4"/>
   </w:num>
-  <w:num w:numId="24">
+  <w:num w:numId="24" w16cid:durableId="636568006">
     <w:abstractNumId w:val="38"/>
   </w:num>
-  <w:num w:numId="25">
+  <w:num w:numId="25" w16cid:durableId="1671639934">
     <w:abstractNumId w:val="2"/>
   </w:num>
-  <w:num w:numId="26">
+  <w:num w:numId="26" w16cid:durableId="1445927836">
     <w:abstractNumId w:val="26"/>
   </w:num>
-  <w:num w:numId="27">
+  <w:num w:numId="27" w16cid:durableId="616523149">
     <w:abstractNumId w:val="32"/>
   </w:num>
-  <w:num w:numId="28">
+  <w:num w:numId="28" w16cid:durableId="445586882">
     <w:abstractNumId w:val="22"/>
   </w:num>
-  <w:num w:numId="29">
+  <w:num w:numId="29" w16cid:durableId="1817842056">
     <w:abstractNumId w:val="11"/>
   </w:num>
-  <w:num w:numId="30">
+  <w:num w:numId="30" w16cid:durableId="1440681396">
     <w:abstractNumId w:val="5"/>
   </w:num>
-  <w:num w:numId="31">
+  <w:num w:numId="31" w16cid:durableId="789325713">
     <w:abstractNumId w:val="29"/>
   </w:num>
-  <w:num w:numId="32">
+  <w:num w:numId="32" w16cid:durableId="877232021">
     <w:abstractNumId w:val="19"/>
   </w:num>
-  <w:num w:numId="33">
+  <w:num w:numId="33" w16cid:durableId="907692365">
     <w:abstractNumId w:val="14"/>
   </w:num>
-  <w:num w:numId="34">
+  <w:num w:numId="34" w16cid:durableId="434255518">
     <w:abstractNumId w:val="23"/>
   </w:num>
-  <w:num w:numId="35">
+  <w:num w:numId="35" w16cid:durableId="427851170">
     <w:abstractNumId w:val="20"/>
   </w:num>
-  <w:num w:numId="36">
+  <w:num w:numId="36" w16cid:durableId="2074766557">
     <w:abstractNumId w:val="30"/>
   </w:num>
-  <w:num w:numId="37">
+  <w:num w:numId="37" w16cid:durableId="804155256">
     <w:abstractNumId w:val="1"/>
   </w:num>
-  <w:num w:numId="38">
+  <w:num w:numId="38" w16cid:durableId="641929258">
     <w:abstractNumId w:val="16"/>
   </w:num>
-  <w:num w:numId="39">
+  <w:num w:numId="39" w16cid:durableId="1199317732">
     <w:abstractNumId w:val="9"/>
   </w:num>
-  <w:num w:numId="40">
+  <w:num w:numId="40" w16cid:durableId="1882666086">
     <w:abstractNumId w:val="27"/>
   </w:num>
-  <w:num w:numId="41">
+  <w:num w:numId="41" w16cid:durableId="1113087986">
     <w:abstractNumId w:val="34"/>
   </w:num>
 </w:numbering>
 </file>
 
 <file path=word/styles.xml><?xml version="1.0" encoding="utf-8"?>
-<w:styles xmlns:mc="http://schemas.openxmlformats.org/markup-compatibility/2006" xmlns:r="http://schemas.openxmlformats.org/officeDocument/2006/relationships" xmlns:w="http://schemas.openxmlformats.org/wordprocessingml/2006/main" xmlns:w14="http://schemas.microsoft.com/office/word/2010/wordml" xmlns:w15="http://schemas.microsoft.com/office/word/2012/wordml" xmlns:w16cex="http://schemas.microsoft.com/office/word/2018/wordml/cex" xmlns:w16cid="http://schemas.microsoft.com/office/word/2016/wordml/cid" xmlns:w16="http://schemas.microsoft.com/office/word/2018/wordml" xmlns:w16sdtdh="http://schemas.microsoft.com/office/word/2020/wordml/sdtdatahash" xmlns:w16se="http://schemas.microsoft.com/office/word/2015/wordml/symex" mc:Ignorable="w14 w15 w16se w16cid w16 w16cex w16sdtdh">
+<w:styles xmlns:mc="http://schemas.openxmlformats.org/markup-compatibility/2006" xmlns:r="http://schemas.openxmlformats.org/officeDocument/2006/relationships" xmlns:w="http://schemas.openxmlformats.org/wordprocessingml/2006/main" xmlns:w14="http://schemas.microsoft.com/office/word/2010/wordml" xmlns:w15="http://schemas.microsoft.com/office/word/2012/wordml" xmlns:w16cex="http://schemas.microsoft.com/office/word/2018/wordml/cex" xmlns:w16cid="http://schemas.microsoft.com/office/word/2016/wordml/cid" xmlns:w16="http://schemas.microsoft.com/office/word/2018/wordml" xmlns:w16du="http://schemas.microsoft.com/office/word/2023/wordml/word16du" xmlns:w16sdtdh="http://schemas.microsoft.com/office/word/2020/wordml/sdtdatahash" xmlns:w16sdtfl="http://schemas.microsoft.com/office/word/2024/wordml/sdtformatlock" xmlns:w16se="http://schemas.microsoft.com/office/word/2015/wordml/symex" mc:Ignorable="w14 w15 w16se w16cid w16 w16cex w16sdtdh w16sdtfl w16du">
   <w:docDefaults>
     <w:rPrDefault>
       <w:rPr>

</xml_diff>